<commit_message>
fix(content): repair editorial source artifacts
</commit_message>
<xml_diff>
--- a/src/content/books/22-kniga-sveta-i-ekrana/ru.docx
+++ b/src/content/books/22-kniga-sveta-i-ekrana/ru.docx
@@ -9629,32 +9629,6 @@
           <w:iCs/>
         </w:rPr>
         <w:t>Конец.</w:t>
-      </w:r>
-    </w:p>
-    <w:p>
-      <w:pPr>
-        <w:rPr>
-          <w:vanish/>
-        </w:rPr>
-      </w:pPr>
-      <w:r>
-        <w:rPr>
-          <w:vanish/>
-        </w:rPr>
-        <w:t>Начало формы</w:t>
-      </w:r>
-    </w:p>
-    <w:p>
-      <w:pPr>
-        <w:rPr>
-          <w:vanish/>
-        </w:rPr>
-      </w:pPr>
-      <w:r>
-        <w:rPr>
-          <w:vanish/>
-        </w:rPr>
-        <w:t>Конец формы</w:t>
       </w:r>
     </w:p>
     <w:p/>

</xml_diff>